<commit_message>
Cambios a agents y readme
</commit_message>
<xml_diff>
--- a/docs/base-de-datos/GUIA DE INSTALACION DE BASE DE DATOS.docx
+++ b/docs/base-de-datos/GUIA DE INSTALACION DE BASE DE DATOS.docx
@@ -30,7 +30,7 @@
           <w:sz w:val="20"/>
           <w:szCs w:val="20"/>
         </w:rPr>
-        <w:t xml:space="preserve">Plataforma de producción de vacunación DDRISS San Marcos · Diseño de BD: MySQL v0.7 y MongoDB v0.5 · 17 de octubre de 2026</w:t>
+        <w:t xml:space="preserve">Plataforma de producción de vacunación DDRISS San Marcos · Diseño de BD: MySQL v0.8 y MongoDB v0.6 · 18 de octubre de 2026</w:t>
       </w:r>
     </w:p>
     <w:p>
@@ -67,7 +67,7 @@
         <w:t xml:space="preserve">Los dos scripts </w:t>
       </w:r>
       <w:r>
-        <w:t xml:space="preserve">de la carpeta diseno-bd: </w:t>
+        <w:t xml:space="preserve">de la carpeta backend/db del repositorio: </w:t>
       </w:r>
       <w:r>
         <w:rPr>
@@ -320,7 +320,7 @@
         <w:spacing w:after="120"/>
       </w:pPr>
       <w:r>
-        <w:t xml:space="preserve">Al terminar debe imprimir las 4 colecciones creadas y sus documentos: catalogo_dimensiones 3, esquemas_captura 6, reglas_validacion 6 y configuracion_indicadores 5.</w:t>
+        <w:t xml:space="preserve">Al terminar debe imprimir las 4 colecciones creadas y sus documentos: catalogo_dimensiones 4, esquemas_captura 6, reglas_validacion 6 y configuracion_indicadores 5.</w:t>
       </w:r>
     </w:p>
     <w:p>
@@ -1046,7 +1046,7 @@
         <w:t xml:space="preserve">Error en el script de MongoDB: </w:t>
       </w:r>
       <w:r>
-        <w:t xml:space="preserve">el script se revisó en sintaxis, pero aún no se había probado en un servidor MongoDB real. Si falla, guarda el mensaje de error completo y compártelo en el hilo del proyecto.</w:t>
+        <w:t xml:space="preserve">revisa que estés usando MongoDB 7 o más reciente y que el comando se ejecute en la carpeta del script. Si sigue fallando, guarda el mensaje de error completo y compártelo con el equipo.</w:t>
       </w:r>
     </w:p>
     <w:p>
@@ -1054,7 +1054,7 @@
         <w:spacing w:after="120"/>
       </w:pPr>
       <w:r>
-        <w:t xml:space="preserve">Las bases solo contienen catálogos y configuración de ejemplo, sin producción ni datos de pacientes. Para entender cada tabla y colección, consulta 05_contexto_base_de_datos.md.</w:t>
+        <w:t xml:space="preserve">Las bases solo contienen catálogos y configuración de ejemplo, sin producción ni datos de pacientes. Para entender cada tabla y colección, consulta docs/base-de-datos/CONTEXTO BD.md.</w:t>
       </w:r>
     </w:p>
     <w:sectPr>

</xml_diff>